<commit_message>
stage 7 and part 8
</commit_message>
<xml_diff>
--- a/לעשות.docx
+++ b/לעשות.docx
@@ -41,23 +41,7 @@
           <w:rFonts w:hint="cs"/>
           <w:rtl/>
         </w:rPr>
-        <w:t xml:space="preserve">לשנות </w:t>
-      </w:r>
-      <w:proofErr w:type="spellStart"/>
-      <w:r>
-        <w:rPr>
-          <w:rFonts w:hint="cs"/>
-          <w:rtl/>
-        </w:rPr>
-        <w:t>הכל</w:t>
-      </w:r>
-      <w:proofErr w:type="spellEnd"/>
-      <w:r>
-        <w:rPr>
-          <w:rFonts w:hint="cs"/>
-          <w:rtl/>
-        </w:rPr>
-        <w:t xml:space="preserve"> לקריאות לינק</w:t>
+        <w:t>לשנות הכל לקריאות לינק</w:t>
       </w:r>
     </w:p>
     <w:p>
@@ -74,7 +58,24 @@
         <w:t>להוסיף לכל הפונקציות כתיבה ללוג</w:t>
       </w:r>
     </w:p>
-    <w:p/>
+    <w:p>
+      <w:pPr>
+        <w:rPr>
+          <w:rFonts w:hint="cs"/>
+          <w:rtl/>
+        </w:rPr>
+      </w:pPr>
+      <w:r>
+        <w:rPr>
+          <w:rFonts w:hint="cs"/>
+          <w:rtl/>
+        </w:rPr>
+        <w:t xml:space="preserve">לבדוק אם לעשות הכל </w:t>
+      </w:r>
+      <w:r>
+        <w:t>init?</w:t>
+      </w:r>
+    </w:p>
     <w:sectPr>
       <w:pgSz w:w="11906" w:h="16838"/>
       <w:pgMar w:top="1440" w:right="1800" w:bottom="1440" w:left="1800" w:header="708" w:footer="708" w:gutter="0"/>

</xml_diff>

<commit_message>
add write to log and delete log func to menu
</commit_message>
<xml_diff>
--- a/לעשות.docx
+++ b/לעשות.docx
@@ -1,6 +1,6 @@
 
 <file path=word/document.xml><?xml version="1.0" encoding="utf-8"?>
-<w:document xmlns:wpc="http://schemas.microsoft.com/office/word/2010/wordprocessingCanvas" xmlns:cx="http://schemas.microsoft.com/office/drawing/2014/chartex" xmlns:cx1="http://schemas.microsoft.com/office/drawing/2015/9/8/chartex" xmlns:cx2="http://schemas.microsoft.com/office/drawing/2015/10/21/chartex" xmlns:cx3="http://schemas.microsoft.com/office/drawing/2016/5/9/chartex" xmlns:cx4="http://schemas.microsoft.com/office/drawing/2016/5/10/chartex" xmlns:cx5="http://schemas.microsoft.com/office/drawing/2016/5/11/chartex" xmlns:cx6="http://schemas.microsoft.com/office/drawing/2016/5/12/chartex" xmlns:cx7="http://schemas.microsoft.com/office/drawing/2016/5/13/chartex" xmlns:cx8="http://schemas.microsoft.com/office/drawing/2016/5/14/chartex" xmlns:mc="http://schemas.openxmlformats.org/markup-compatibility/2006" xmlns:aink="http://schemas.microsoft.com/office/drawing/2016/ink" xmlns:am3d="http://schemas.microsoft.com/office/drawing/2017/model3d" xmlns:o="urn:schemas-microsoft-com:office:office" xmlns:r="http://schemas.openxmlformats.org/officeDocument/2006/relationships" xmlns:m="http://schemas.openxmlformats.org/officeDocument/2006/math" xmlns:v="urn:schemas-microsoft-com:vml" xmlns:wp14="http://schemas.microsoft.com/office/word/2010/wordprocessingDrawing" xmlns:wp="http://schemas.openxmlformats.org/drawingml/2006/wordprocessingDrawing" xmlns:w10="urn:schemas-microsoft-com:office:word" xmlns:w="http://schemas.openxmlformats.org/wordprocessingml/2006/main" xmlns:w14="http://schemas.microsoft.com/office/word/2010/wordml" xmlns:w15="http://schemas.microsoft.com/office/word/2012/wordml" xmlns:w16cex="http://schemas.microsoft.com/office/word/2018/wordml/cex" xmlns:w16cid="http://schemas.microsoft.com/office/word/2016/wordml/cid" xmlns:w16="http://schemas.microsoft.com/office/word/2018/wordml" xmlns:w16sdtdh="http://schemas.microsoft.com/office/word/2020/wordml/sdtdatahash" xmlns:w16se="http://schemas.microsoft.com/office/word/2015/wordml/symex" xmlns:wpg="http://schemas.microsoft.com/office/word/2010/wordprocessingGroup" xmlns:wpi="http://schemas.microsoft.com/office/word/2010/wordprocessingInk" xmlns:wne="http://schemas.microsoft.com/office/word/2006/wordml" xmlns:wps="http://schemas.microsoft.com/office/word/2010/wordprocessingShape" mc:Ignorable="w14 w15 w16se w16cid w16 w16cex w16sdtdh wp14">
+<w:document xmlns:wpc="http://schemas.microsoft.com/office/word/2010/wordprocessingCanvas" xmlns:cx="http://schemas.microsoft.com/office/drawing/2014/chartex" xmlns:cx1="http://schemas.microsoft.com/office/drawing/2015/9/8/chartex" xmlns:cx2="http://schemas.microsoft.com/office/drawing/2015/10/21/chartex" xmlns:cx3="http://schemas.microsoft.com/office/drawing/2016/5/9/chartex" xmlns:cx4="http://schemas.microsoft.com/office/drawing/2016/5/10/chartex" xmlns:cx5="http://schemas.microsoft.com/office/drawing/2016/5/11/chartex" xmlns:cx6="http://schemas.microsoft.com/office/drawing/2016/5/12/chartex" xmlns:cx7="http://schemas.microsoft.com/office/drawing/2016/5/13/chartex" xmlns:cx8="http://schemas.microsoft.com/office/drawing/2016/5/14/chartex" xmlns:mc="http://schemas.openxmlformats.org/markup-compatibility/2006" xmlns:aink="http://schemas.microsoft.com/office/drawing/2016/ink" xmlns:am3d="http://schemas.microsoft.com/office/drawing/2017/model3d" xmlns:o="urn:schemas-microsoft-com:office:office" xmlns:oel="http://schemas.microsoft.com/office/2019/extlst" xmlns:r="http://schemas.openxmlformats.org/officeDocument/2006/relationships" xmlns:m="http://schemas.openxmlformats.org/officeDocument/2006/math" xmlns:v="urn:schemas-microsoft-com:vml" xmlns:wp14="http://schemas.microsoft.com/office/word/2010/wordprocessingDrawing" xmlns:wp="http://schemas.openxmlformats.org/drawingml/2006/wordprocessingDrawing" xmlns:w10="urn:schemas-microsoft-com:office:word" xmlns:w="http://schemas.openxmlformats.org/wordprocessingml/2006/main" xmlns:w14="http://schemas.microsoft.com/office/word/2010/wordml" xmlns:w15="http://schemas.microsoft.com/office/word/2012/wordml" xmlns:w16cex="http://schemas.microsoft.com/office/word/2018/wordml/cex" xmlns:w16cid="http://schemas.microsoft.com/office/word/2016/wordml/cid" xmlns:w16="http://schemas.microsoft.com/office/word/2018/wordml" xmlns:w16du="http://schemas.microsoft.com/office/word/2023/wordml/word16du" xmlns:w16sdtdh="http://schemas.microsoft.com/office/word/2020/wordml/sdtdatahash" xmlns:w16sdtfl="http://schemas.microsoft.com/office/word/2024/wordml/sdtformatlock" xmlns:w16se="http://schemas.microsoft.com/office/word/2015/wordml/symex" xmlns:wpg="http://schemas.microsoft.com/office/word/2010/wordprocessingGroup" xmlns:wpi="http://schemas.microsoft.com/office/word/2010/wordprocessingInk" xmlns:wne="http://schemas.microsoft.com/office/word/2006/wordml" xmlns:wps="http://schemas.microsoft.com/office/word/2010/wordprocessingShape" mc:Ignorable="w14 w15 w16se w16cid w16 w16cex w16sdtdh w16sdtfl w16du wp14">
   <w:body>
     <w:p>
       <w:pPr>
@@ -19,49 +19,6 @@
     <w:p>
       <w:pPr>
         <w:rPr>
-          <w:rtl/>
-        </w:rPr>
-      </w:pPr>
-      <w:r>
-        <w:rPr>
-          <w:rFonts w:hint="cs"/>
-          <w:rtl/>
-        </w:rPr>
-        <w:t>לזמן את הפונקציה</w:t>
-      </w:r>
-    </w:p>
-    <w:p>
-      <w:pPr>
-        <w:rPr>
-          <w:rtl/>
-        </w:rPr>
-      </w:pPr>
-      <w:r>
-        <w:rPr>
-          <w:rFonts w:hint="cs"/>
-          <w:rtl/>
-        </w:rPr>
-        <w:t>לשנות הכל לקריאות לינק</w:t>
-      </w:r>
-    </w:p>
-    <w:p>
-      <w:pPr>
-        <w:rPr>
-          <w:rtl/>
-        </w:rPr>
-      </w:pPr>
-      <w:r>
-        <w:rPr>
-          <w:rFonts w:hint="cs"/>
-          <w:rtl/>
-        </w:rPr>
-        <w:t>להוסיף לכל הפונקציות כתיבה ללוג</w:t>
-      </w:r>
-    </w:p>
-    <w:p>
-      <w:pPr>
-        <w:rPr>
-          <w:rFonts w:hint="cs"/>
           <w:rtl/>
         </w:rPr>
       </w:pPr>
@@ -89,7 +46,7 @@
 </file>
 
 <file path=word/styles.xml><?xml version="1.0" encoding="utf-8"?>
-<w:styles xmlns:mc="http://schemas.openxmlformats.org/markup-compatibility/2006" xmlns:r="http://schemas.openxmlformats.org/officeDocument/2006/relationships" xmlns:w="http://schemas.openxmlformats.org/wordprocessingml/2006/main" xmlns:w14="http://schemas.microsoft.com/office/word/2010/wordml" xmlns:w15="http://schemas.microsoft.com/office/word/2012/wordml" xmlns:w16cex="http://schemas.microsoft.com/office/word/2018/wordml/cex" xmlns:w16cid="http://schemas.microsoft.com/office/word/2016/wordml/cid" xmlns:w16="http://schemas.microsoft.com/office/word/2018/wordml" xmlns:w16sdtdh="http://schemas.microsoft.com/office/word/2020/wordml/sdtdatahash" xmlns:w16se="http://schemas.microsoft.com/office/word/2015/wordml/symex" mc:Ignorable="w14 w15 w16se w16cid w16 w16cex w16sdtdh">
+<w:styles xmlns:mc="http://schemas.openxmlformats.org/markup-compatibility/2006" xmlns:r="http://schemas.openxmlformats.org/officeDocument/2006/relationships" xmlns:w="http://schemas.openxmlformats.org/wordprocessingml/2006/main" xmlns:w14="http://schemas.microsoft.com/office/word/2010/wordml" xmlns:w15="http://schemas.microsoft.com/office/word/2012/wordml" xmlns:w16cex="http://schemas.microsoft.com/office/word/2018/wordml/cex" xmlns:w16cid="http://schemas.microsoft.com/office/word/2016/wordml/cid" xmlns:w16="http://schemas.microsoft.com/office/word/2018/wordml" xmlns:w16du="http://schemas.microsoft.com/office/word/2023/wordml/word16du" xmlns:w16sdtdh="http://schemas.microsoft.com/office/word/2020/wordml/sdtdatahash" xmlns:w16sdtfl="http://schemas.microsoft.com/office/word/2024/wordml/sdtformatlock" xmlns:w16se="http://schemas.microsoft.com/office/word/2015/wordml/symex" mc:Ignorable="w14 w15 w16se w16cid w16 w16cex w16sdtdh w16sdtfl w16du">
   <w:docDefaults>
     <w:rPrDefault>
       <w:rPr>

</xml_diff>

<commit_message>
finish level nine michal
</commit_message>
<xml_diff>
--- a/לעשות.docx
+++ b/לעשות.docx
@@ -29,9 +29,56 @@
         </w:rPr>
         <w:t xml:space="preserve">לבדוק אם לעשות הכל </w:t>
       </w:r>
+      <w:proofErr w:type="spellStart"/>
       <w:r>
-        <w:t>init?</w:t>
+        <w:t>init</w:t>
       </w:r>
+      <w:proofErr w:type="spellEnd"/>
+      <w:r>
+        <w:t>?</w:t>
+      </w:r>
+      <w:r>
+        <w:rPr>
+          <w:rFonts w:hint="cs"/>
+          <w:rtl/>
+        </w:rPr>
+        <w:t xml:space="preserve"> בשלב 8</w:t>
+      </w:r>
+    </w:p>
+    <w:p>
+      <w:pPr>
+        <w:rPr>
+          <w:rtl/>
+        </w:rPr>
+      </w:pPr>
+      <w:r>
+        <w:rPr>
+          <w:rFonts w:hint="cs"/>
+          <w:rtl/>
+        </w:rPr>
+        <w:t>לסיים שלב 8</w:t>
+      </w:r>
+    </w:p>
+    <w:p>
+      <w:pPr>
+        <w:rPr>
+          <w:rtl/>
+        </w:rPr>
+      </w:pPr>
+      <w:r>
+        <w:rPr>
+          <w:rFonts w:hint="cs"/>
+          <w:rtl/>
+        </w:rPr>
+        <w:t>לבדוק 9</w:t>
+      </w:r>
+    </w:p>
+    <w:p>
+      <w:pPr>
+        <w:rPr>
+          <w:rtl/>
+        </w:rPr>
+      </w:pPr>
     </w:p>
     <w:sectPr>
       <w:pgSz w:w="11906" w:h="16838"/>

</xml_diff>

<commit_message>
finish level 8 implementations
</commit_message>
<xml_diff>
--- a/לעשות.docx
+++ b/לעשות.docx
@@ -5,58 +5,9 @@
     <w:p>
       <w:pPr>
         <w:rPr>
-          <w:rFonts w:hint="cs"/>
           <w:rtl/>
         </w:rPr>
       </w:pPr>
-      <w:r>
-        <w:rPr>
-          <w:rFonts w:hint="cs"/>
-          <w:rtl/>
-        </w:rPr>
-        <w:t>להוסיף בכל מקום של זריקה ב</w:t>
-      </w:r>
-      <w:r>
-        <w:t>BL</w:t>
-      </w:r>
-      <w:r>
-        <w:rPr>
-          <w:rFonts w:hint="cs"/>
-          <w:rtl/>
-        </w:rPr>
-        <w:t xml:space="preserve"> לזריקה של שגיאה מתאימה!</w:t>
-      </w:r>
-    </w:p>
-    <w:p>
-      <w:pPr>
-        <w:rPr>
-          <w:rtl/>
-        </w:rPr>
-      </w:pPr>
-      <w:r>
-        <w:rPr>
-          <w:rFonts w:hint="cs"/>
-          <w:rtl/>
-        </w:rPr>
-        <w:t xml:space="preserve">לבדוק אם לעשות הכל </w:t>
-      </w:r>
-      <w:proofErr w:type="spellStart"/>
-      <w:r>
-        <w:t>init</w:t>
-      </w:r>
-      <w:proofErr w:type="spellEnd"/>
-      <w:r>
-        <w:t>?</w:t>
-      </w:r>
-      <w:r>
-        <w:rPr>
-          <w:rFonts w:hint="cs"/>
-          <w:rtl/>
-        </w:rPr>
-        <w:t xml:space="preserve"> בשלב 8</w:t>
-      </w:r>
-    </w:p>
-    <w:p>
       <w:r>
         <w:rPr>
           <w:rFonts w:hint="cs"/>
@@ -71,8 +22,31 @@
       <w:proofErr w:type="spellEnd"/>
     </w:p>
     <w:p>
+      <w:r>
+        <w:rPr>
+          <w:rFonts w:hint="cs"/>
+          <w:rtl/>
+        </w:rPr>
+        <w:t xml:space="preserve">לממש ב </w:t>
+      </w:r>
+      <w:proofErr w:type="spellStart"/>
+      <w:r>
+        <w:t>dalxml</w:t>
+      </w:r>
+      <w:proofErr w:type="spellEnd"/>
+      <w:r>
+        <w:t xml:space="preserve"> - </w:t>
+      </w:r>
+      <w:proofErr w:type="spellStart"/>
+      <w:r>
+        <w:t>productimplementation</w:t>
+      </w:r>
+      <w:proofErr w:type="spellEnd"/>
+    </w:p>
+    <w:p>
       <w:pPr>
         <w:rPr>
+          <w:rFonts w:hint="cs"/>
           <w:rtl/>
         </w:rPr>
       </w:pPr>
@@ -87,6 +61,56 @@
     </w:sectPr>
   </w:body>
 </w:document>
+</file>
+
+<file path=word/endnotes.xml><?xml version="1.0" encoding="utf-8"?>
+<w:endnotes xmlns:wpc="http://schemas.microsoft.com/office/word/2010/wordprocessingCanvas" xmlns:cx="http://schemas.microsoft.com/office/drawing/2014/chartex" xmlns:cx1="http://schemas.microsoft.com/office/drawing/2015/9/8/chartex" xmlns:cx2="http://schemas.microsoft.com/office/drawing/2015/10/21/chartex" xmlns:cx3="http://schemas.microsoft.com/office/drawing/2016/5/9/chartex" xmlns:cx4="http://schemas.microsoft.com/office/drawing/2016/5/10/chartex" xmlns:cx5="http://schemas.microsoft.com/office/drawing/2016/5/11/chartex" xmlns:cx6="http://schemas.microsoft.com/office/drawing/2016/5/12/chartex" xmlns:cx7="http://schemas.microsoft.com/office/drawing/2016/5/13/chartex" xmlns:cx8="http://schemas.microsoft.com/office/drawing/2016/5/14/chartex" xmlns:mc="http://schemas.openxmlformats.org/markup-compatibility/2006" xmlns:aink="http://schemas.microsoft.com/office/drawing/2016/ink" xmlns:am3d="http://schemas.microsoft.com/office/drawing/2017/model3d" xmlns:o="urn:schemas-microsoft-com:office:office" xmlns:oel="http://schemas.microsoft.com/office/2019/extlst" xmlns:r="http://schemas.openxmlformats.org/officeDocument/2006/relationships" xmlns:m="http://schemas.openxmlformats.org/officeDocument/2006/math" xmlns:v="urn:schemas-microsoft-com:vml" xmlns:wp14="http://schemas.microsoft.com/office/word/2010/wordprocessingDrawing" xmlns:wp="http://schemas.openxmlformats.org/drawingml/2006/wordprocessingDrawing" xmlns:w10="urn:schemas-microsoft-com:office:word" xmlns:w="http://schemas.openxmlformats.org/wordprocessingml/2006/main" xmlns:w14="http://schemas.microsoft.com/office/word/2010/wordml" xmlns:w15="http://schemas.microsoft.com/office/word/2012/wordml" xmlns:w16cex="http://schemas.microsoft.com/office/word/2018/wordml/cex" xmlns:w16cid="http://schemas.microsoft.com/office/word/2016/wordml/cid" xmlns:w16="http://schemas.microsoft.com/office/word/2018/wordml" xmlns:w16du="http://schemas.microsoft.com/office/word/2023/wordml/word16du" xmlns:w16sdtdh="http://schemas.microsoft.com/office/word/2020/wordml/sdtdatahash" xmlns:w16sdtfl="http://schemas.microsoft.com/office/word/2024/wordml/sdtformatlock" xmlns:w16se="http://schemas.microsoft.com/office/word/2015/wordml/symex" xmlns:wpg="http://schemas.microsoft.com/office/word/2010/wordprocessingGroup" xmlns:wpi="http://schemas.microsoft.com/office/word/2010/wordprocessingInk" xmlns:wne="http://schemas.microsoft.com/office/word/2006/wordml" xmlns:wps="http://schemas.microsoft.com/office/word/2010/wordprocessingShape" mc:Ignorable="w14 w15 w16se w16cid w16 w16cex w16sdtdh w16sdtfl w16du wp14">
+  <w:endnote w:type="separator" w:id="-1">
+    <w:p>
+      <w:pPr>
+        <w:spacing w:after="0" w:line="240" w:lineRule="auto"/>
+      </w:pPr>
+      <w:r>
+        <w:separator/>
+      </w:r>
+    </w:p>
+  </w:endnote>
+  <w:endnote w:type="continuationSeparator" w:id="0">
+    <w:p>
+      <w:pPr>
+        <w:spacing w:after="0" w:line="240" w:lineRule="auto"/>
+      </w:pPr>
+      <w:r>
+        <w:continuationSeparator/>
+      </w:r>
+    </w:p>
+  </w:endnote>
+</w:endnotes>
+</file>
+
+<file path=word/footnotes.xml><?xml version="1.0" encoding="utf-8"?>
+<w:footnotes xmlns:wpc="http://schemas.microsoft.com/office/word/2010/wordprocessingCanvas" xmlns:cx="http://schemas.microsoft.com/office/drawing/2014/chartex" xmlns:cx1="http://schemas.microsoft.com/office/drawing/2015/9/8/chartex" xmlns:cx2="http://schemas.microsoft.com/office/drawing/2015/10/21/chartex" xmlns:cx3="http://schemas.microsoft.com/office/drawing/2016/5/9/chartex" xmlns:cx4="http://schemas.microsoft.com/office/drawing/2016/5/10/chartex" xmlns:cx5="http://schemas.microsoft.com/office/drawing/2016/5/11/chartex" xmlns:cx6="http://schemas.microsoft.com/office/drawing/2016/5/12/chartex" xmlns:cx7="http://schemas.microsoft.com/office/drawing/2016/5/13/chartex" xmlns:cx8="http://schemas.microsoft.com/office/drawing/2016/5/14/chartex" xmlns:mc="http://schemas.openxmlformats.org/markup-compatibility/2006" xmlns:aink="http://schemas.microsoft.com/office/drawing/2016/ink" xmlns:am3d="http://schemas.microsoft.com/office/drawing/2017/model3d" xmlns:o="urn:schemas-microsoft-com:office:office" xmlns:oel="http://schemas.microsoft.com/office/2019/extlst" xmlns:r="http://schemas.openxmlformats.org/officeDocument/2006/relationships" xmlns:m="http://schemas.openxmlformats.org/officeDocument/2006/math" xmlns:v="urn:schemas-microsoft-com:vml" xmlns:wp14="http://schemas.microsoft.com/office/word/2010/wordprocessingDrawing" xmlns:wp="http://schemas.openxmlformats.org/drawingml/2006/wordprocessingDrawing" xmlns:w10="urn:schemas-microsoft-com:office:word" xmlns:w="http://schemas.openxmlformats.org/wordprocessingml/2006/main" xmlns:w14="http://schemas.microsoft.com/office/word/2010/wordml" xmlns:w15="http://schemas.microsoft.com/office/word/2012/wordml" xmlns:w16cex="http://schemas.microsoft.com/office/word/2018/wordml/cex" xmlns:w16cid="http://schemas.microsoft.com/office/word/2016/wordml/cid" xmlns:w16="http://schemas.microsoft.com/office/word/2018/wordml" xmlns:w16du="http://schemas.microsoft.com/office/word/2023/wordml/word16du" xmlns:w16sdtdh="http://schemas.microsoft.com/office/word/2020/wordml/sdtdatahash" xmlns:w16sdtfl="http://schemas.microsoft.com/office/word/2024/wordml/sdtformatlock" xmlns:w16se="http://schemas.microsoft.com/office/word/2015/wordml/symex" xmlns:wpg="http://schemas.microsoft.com/office/word/2010/wordprocessingGroup" xmlns:wpi="http://schemas.microsoft.com/office/word/2010/wordprocessingInk" xmlns:wne="http://schemas.microsoft.com/office/word/2006/wordml" xmlns:wps="http://schemas.microsoft.com/office/word/2010/wordprocessingShape" mc:Ignorable="w14 w15 w16se w16cid w16 w16cex w16sdtdh w16sdtfl w16du wp14">
+  <w:footnote w:type="separator" w:id="-1">
+    <w:p>
+      <w:pPr>
+        <w:spacing w:after="0" w:line="240" w:lineRule="auto"/>
+      </w:pPr>
+      <w:r>
+        <w:separator/>
+      </w:r>
+    </w:p>
+  </w:footnote>
+  <w:footnote w:type="continuationSeparator" w:id="0">
+    <w:p>
+      <w:pPr>
+        <w:spacing w:after="0" w:line="240" w:lineRule="auto"/>
+      </w:pPr>
+      <w:r>
+        <w:continuationSeparator/>
+      </w:r>
+    </w:p>
+  </w:footnote>
+</w:footnotes>
 </file>
 
 <file path=word/styles.xml><?xml version="1.0" encoding="utf-8"?>
@@ -518,6 +542,50 @@
     <w:semiHidden/>
     <w:unhideWhenUsed/>
   </w:style>
+  <w:style w:type="paragraph" w:styleId="a3">
+    <w:name w:val="header"/>
+    <w:basedOn w:val="a"/>
+    <w:link w:val="a4"/>
+    <w:uiPriority w:val="99"/>
+    <w:unhideWhenUsed/>
+    <w:rsid w:val="00D3608E"/>
+    <w:pPr>
+      <w:tabs>
+        <w:tab w:val="center" w:pos="4153"/>
+        <w:tab w:val="right" w:pos="8306"/>
+      </w:tabs>
+      <w:spacing w:after="0" w:line="240" w:lineRule="auto"/>
+    </w:pPr>
+  </w:style>
+  <w:style w:type="character" w:customStyle="1" w:styleId="a4">
+    <w:name w:val="כותרת עליונה תו"/>
+    <w:basedOn w:val="a0"/>
+    <w:link w:val="a3"/>
+    <w:uiPriority w:val="99"/>
+    <w:rsid w:val="00D3608E"/>
+  </w:style>
+  <w:style w:type="paragraph" w:styleId="a5">
+    <w:name w:val="footer"/>
+    <w:basedOn w:val="a"/>
+    <w:link w:val="a6"/>
+    <w:uiPriority w:val="99"/>
+    <w:unhideWhenUsed/>
+    <w:rsid w:val="00D3608E"/>
+    <w:pPr>
+      <w:tabs>
+        <w:tab w:val="center" w:pos="4153"/>
+        <w:tab w:val="right" w:pos="8306"/>
+      </w:tabs>
+      <w:spacing w:after="0" w:line="240" w:lineRule="auto"/>
+    </w:pPr>
+  </w:style>
+  <w:style w:type="character" w:customStyle="1" w:styleId="a6">
+    <w:name w:val="כותרת תחתונה תו"/>
+    <w:basedOn w:val="a0"/>
+    <w:link w:val="a5"/>
+    <w:uiPriority w:val="99"/>
+    <w:rsid w:val="00D3608E"/>
+  </w:style>
 </w:styles>
 </file>
 

</xml_diff>